<commit_message>
Add FR.APL.01 docx templates and update template search path in AsesiController
</commit_message>
<xml_diff>
--- a/storage/template/fr_ak_01.docx
+++ b/storage/template/fr_ak_01.docx
@@ -2451,7 +2451,7 @@
                 <w:tab w:val="left" w:pos="4413"/>
               </w:tabs>
               <w:spacing w:before="1"/>
-              <w:ind w:left="2445"/>
+              <w:ind w:left="2264"/>
               <w:rPr>
                 <w:lang w:val="en-US"/>
               </w:rPr>
@@ -2526,7 +2526,7 @@
               <w:t xml:space="preserve"> </w:t>
             </w:r>
             <w:r>
-              <w:t>...................................</w:t>
+              <w:t>……………………………</w:t>
             </w:r>
             <w:r>
               <w:tab/>
@@ -2584,7 +2584,7 @@
             <w:pPr>
               <w:pStyle w:val="TableParagraph"/>
               <w:spacing w:before="1"/>
-              <w:ind w:left="2445"/>
+              <w:ind w:left="2264"/>
               <w:rPr>
                 <w:rFonts w:ascii="Times New Roman"/>
                 <w:sz w:val="21"/>
@@ -2667,7 +2667,7 @@
               <w:t xml:space="preserve"> </w:t>
             </w:r>
             <w:r>
-              <w:t>...................................</w:t>
+              <w:t>……………………………</w:t>
             </w:r>
             <w:r>
               <w:tab/>

</xml_diff>